<commit_message>
#2 Science and Religion
</commit_message>
<xml_diff>
--- a/Topics/12 Key Principles/Science_and_religion(Case Studies).docx
+++ b/Topics/12 Key Principles/Science_and_religion(Case Studies).docx
@@ -132,7 +132,45 @@
               <w:rPr>
                 <w:lang w:val="en-US"/>
               </w:rPr>
-              <w:t>The idea that Earth was at the center of the universe and everything revolved around it. This belief stemmed from:</w:t>
+              <w:t xml:space="preserve">The idea that </w:t>
+            </w:r>
+            <w:r>
+              <w:rPr>
+                <w:i/>
+                <w:iCs/>
+                <w:lang w:val="en-US"/>
+              </w:rPr>
+              <w:t>Earth</w:t>
+            </w:r>
+            <w:r>
+              <w:rPr>
+                <w:lang w:val="en-US"/>
+              </w:rPr>
+              <w:t xml:space="preserve"> was at the center of the universe and </w:t>
+            </w:r>
+            <w:r>
+              <w:rPr>
+                <w:lang w:val="en-US"/>
+              </w:rPr>
+              <w:t xml:space="preserve">all celestial bodies (Planets, moons and the sun) </w:t>
+            </w:r>
+            <w:r>
+              <w:rPr>
+                <w:lang w:val="en-US"/>
+              </w:rPr>
+              <w:t xml:space="preserve">revolved around </w:t>
+            </w:r>
+            <w:r>
+              <w:rPr>
+                <w:lang w:val="en-US"/>
+              </w:rPr>
+              <w:t>earth</w:t>
+            </w:r>
+            <w:r>
+              <w:rPr>
+                <w:lang w:val="en-US"/>
+              </w:rPr>
+              <w:t>. This belief stemmed from:</w:t>
             </w:r>
           </w:p>
           <w:p>
@@ -228,7 +266,19 @@
               <w:rPr>
                 <w:lang w:val="en-US"/>
               </w:rPr>
-              <w:t xml:space="preserve">Literal interpretations </w:t>
+              <w:t xml:space="preserve">Literal </w:t>
+            </w:r>
+            <w:r>
+              <w:rPr>
+                <w:lang w:val="en-US"/>
+              </w:rPr>
+              <w:t xml:space="preserve">scriptural </w:t>
+            </w:r>
+            <w:r>
+              <w:rPr>
+                <w:lang w:val="en-US"/>
+              </w:rPr>
+              <w:t xml:space="preserve">interpretations </w:t>
             </w:r>
             <w:r>
               <w:rPr>
@@ -332,7 +382,7 @@
               <w:rPr>
                 <w:lang w:val="en-US"/>
               </w:rPr>
-              <w:t>Promoting</w:t>
+              <w:t>Galileo promoted</w:t>
             </w:r>
             <w:r>
               <w:rPr>
@@ -358,7 +408,27 @@
               <w:rPr>
                 <w:lang w:val="en-US"/>
               </w:rPr>
-              <w:t xml:space="preserve"> the sun was at the center)</w:t>
+              <w:t xml:space="preserve"> the sun was at the </w:t>
+            </w:r>
+            <w:proofErr w:type="gramStart"/>
+            <w:r>
+              <w:rPr>
+                <w:lang w:val="en-US"/>
+              </w:rPr>
+              <w:t>center</w:t>
+            </w:r>
+            <w:proofErr w:type="gramEnd"/>
+            <w:r>
+              <w:rPr>
+                <w:lang w:val="en-US"/>
+              </w:rPr>
+              <w:t xml:space="preserve"> and everything revolved around the sun</w:t>
+            </w:r>
+            <w:r>
+              <w:rPr>
+                <w:lang w:val="en-US"/>
+              </w:rPr>
+              <w:t>)</w:t>
             </w:r>
             <w:r>
               <w:rPr>
@@ -543,14 +613,30 @@
               </w:rPr>
               <w:t xml:space="preserve"> instead orbited around the sun (</w:t>
             </w:r>
-            <w:proofErr w:type="spellStart"/>
-            <w:r>
-              <w:rPr>
-                <w:lang w:val="en-US"/>
-              </w:rPr>
-              <w:t>Haleocentrism</w:t>
-            </w:r>
-            <w:proofErr w:type="spellEnd"/>
+            <w:r>
+              <w:rPr>
+                <w:b/>
+                <w:bCs/>
+                <w:lang w:val="en-US"/>
+              </w:rPr>
+              <w:t>H</w:t>
+            </w:r>
+            <w:r>
+              <w:rPr>
+                <w:b/>
+                <w:bCs/>
+                <w:lang w:val="en-US"/>
+              </w:rPr>
+              <w:t>eli</w:t>
+            </w:r>
+            <w:r>
+              <w:rPr>
+                <w:b/>
+                <w:bCs/>
+                <w:lang w:val="en-US"/>
+              </w:rPr>
+              <w:t>ocentrism</w:t>
+            </w:r>
             <w:r>
               <w:rPr>
                 <w:lang w:val="en-US"/>
@@ -575,24 +661,54 @@
               <w:t>G</w:t>
             </w:r>
             <w:r>
-              <w:t>alileo's writings on heliocentrism faced both religious and scientific objections.</w:t>
+              <w:t xml:space="preserve">alileo's writings on heliocentrism faced </w:t>
+            </w:r>
+            <w:r>
+              <w:t>strong opposition from both</w:t>
+            </w:r>
+            <w:r>
+              <w:t xml:space="preserve"> religious and scientific </w:t>
+            </w:r>
+            <w:r>
+              <w:t>authorities</w:t>
+            </w:r>
+            <w:r>
+              <w:t>.</w:t>
             </w:r>
             <w:r>
               <w:t xml:space="preserve"> </w:t>
             </w:r>
             <w:r>
-              <w:t xml:space="preserve">Church authorities rejected the </w:t>
-            </w:r>
-            <w:proofErr w:type="gramStart"/>
-            <w:r>
-              <w:t>idea,</w:t>
-            </w:r>
-            <w:proofErr w:type="gramEnd"/>
-            <w:r>
-              <w:t xml:space="preserve"> he was tried in court and placed under house arrest being forced to recant</w:t>
+              <w:t>The churches</w:t>
+            </w:r>
+            <w:r>
+              <w:t xml:space="preserve"> rejected the idea</w:t>
+            </w:r>
+            <w:r>
+              <w:t xml:space="preserve"> due to its contradiction with their literal interpretations.</w:t>
+            </w:r>
+            <w:r>
+              <w:t xml:space="preserve"> </w:t>
+            </w:r>
+            <w:r>
+              <w:t>Galileo</w:t>
+            </w:r>
+            <w:r>
+              <w:t xml:space="preserve"> was tried in court and placed under house arrest being forced to recant</w:t>
             </w:r>
             <w:r>
               <w:t xml:space="preserve"> his scientific proposal.</w:t>
+            </w:r>
+            <w:r>
+              <w:t xml:space="preserve"> </w:t>
+            </w:r>
+            <w:proofErr w:type="spellStart"/>
+            <w:r>
+              <w:t>Galileos</w:t>
+            </w:r>
+            <w:proofErr w:type="spellEnd"/>
+            <w:r>
+              <w:t xml:space="preserve"> discovery did not conflict with religion, but it showed us how literal interpretations or misapplications of the domain of religion can lead to conflict.</w:t>
             </w:r>
           </w:p>
         </w:tc>
@@ -636,33 +752,7 @@
               <w:rPr>
                 <w:lang w:val="en-US"/>
               </w:rPr>
-              <w:t>;</w:t>
-            </w:r>
-            <w:r>
-              <w:rPr>
-                <w:lang w:val="en-US"/>
-              </w:rPr>
-              <w:t xml:space="preserve"> </w:t>
-            </w:r>
-            <w:proofErr w:type="gramStart"/>
-            <w:r>
-              <w:rPr>
-                <w:lang w:val="en-US"/>
-              </w:rPr>
-              <w:t>and</w:t>
-            </w:r>
-            <w:r>
-              <w:rPr>
-                <w:lang w:val="en-US"/>
-              </w:rPr>
-              <w:t>,</w:t>
-            </w:r>
-            <w:proofErr w:type="gramEnd"/>
-            <w:r>
-              <w:rPr>
-                <w:lang w:val="en-US"/>
-              </w:rPr>
-              <w:t xml:space="preserve"> </w:t>
+              <w:t xml:space="preserve">; </w:t>
             </w:r>
             <w:r>
               <w:rPr>
@@ -697,9 +787,22 @@
             </w:r>
             <w:r>
               <w:rPr>
-                <w:lang w:val="en-US"/>
-              </w:rPr>
-              <w:t>.</w:t>
+                <w:vertAlign w:val="superscript"/>
+                <w:lang w:val="en-US"/>
+              </w:rPr>
+              <w:t xml:space="preserve"> </w:t>
+            </w:r>
+            <w:r>
+              <w:rPr>
+                <w:lang w:val="en-US"/>
+              </w:rPr>
+              <w:t xml:space="preserve">– implying that species are fixed and earth is </w:t>
+            </w:r>
+            <w:r>
+              <w:rPr>
+                <w:lang w:val="en-US"/>
+              </w:rPr>
+              <w:t>relatively young</w:t>
             </w:r>
           </w:p>
           <w:p>
@@ -717,6 +820,7 @@
               <w:rPr>
                 <w:lang w:val="en-US"/>
               </w:rPr>
+              <w:lastRenderedPageBreak/>
               <w:t>Philosophical ideas: Humans were the centerpiece of creation. The structure of life reinforced a sense of purpose and hierarchy</w:t>
             </w:r>
           </w:p>
@@ -737,7 +841,73 @@
               <w:rPr>
                 <w:lang w:val="en-US"/>
               </w:rPr>
-              <w:t>Darin came along, and observed the following:</w:t>
+              <w:t>Dar</w:t>
+            </w:r>
+            <w:r>
+              <w:rPr>
+                <w:lang w:val="en-US"/>
+              </w:rPr>
+              <w:t>w</w:t>
+            </w:r>
+            <w:r>
+              <w:rPr>
+                <w:lang w:val="en-US"/>
+              </w:rPr>
+              <w:t xml:space="preserve">in </w:t>
+            </w:r>
+            <w:r>
+              <w:rPr>
+                <w:lang w:val="en-US"/>
+              </w:rPr>
+              <w:t xml:space="preserve">published </w:t>
+            </w:r>
+            <w:r>
+              <w:rPr>
+                <w:lang w:val="en-US"/>
+              </w:rPr>
+              <w:t>“</w:t>
+            </w:r>
+            <w:r>
+              <w:rPr>
+                <w:i/>
+                <w:iCs/>
+                <w:lang w:val="en-US"/>
+              </w:rPr>
+              <w:t>On the Origin of Species</w:t>
+            </w:r>
+            <w:r>
+              <w:rPr>
+                <w:i/>
+                <w:iCs/>
+                <w:lang w:val="en-US"/>
+              </w:rPr>
+              <w:t>”</w:t>
+            </w:r>
+            <w:r>
+              <w:rPr>
+                <w:i/>
+                <w:iCs/>
+                <w:lang w:val="en-US"/>
+              </w:rPr>
+              <w:t xml:space="preserve"> </w:t>
+            </w:r>
+            <w:r>
+              <w:rPr>
+                <w:lang w:val="en-US"/>
+              </w:rPr>
+              <w:t>in 1859</w:t>
+            </w:r>
+            <w:r>
+              <w:rPr>
+                <w:lang w:val="en-US"/>
+              </w:rPr>
+              <w:t xml:space="preserve"> and proposed that species change over time with natural selection. Individuals with advantageous traits survive and reproduce and over long periods of time, lead to new species.</w:t>
+            </w:r>
+            <w:r>
+              <w:rPr>
+                <w:lang w:val="en-US"/>
+              </w:rPr>
+              <w:t xml:space="preserve"> This observed:</w:t>
             </w:r>
           </w:p>
           <w:p>
@@ -755,21 +925,7 @@
               <w:rPr>
                 <w:lang w:val="en-US"/>
               </w:rPr>
-              <w:t>Variations among species (</w:t>
-            </w:r>
-            <w:proofErr w:type="spellStart"/>
-            <w:r>
-              <w:rPr>
-                <w:lang w:val="en-US"/>
-              </w:rPr>
-              <w:t>i.e</w:t>
-            </w:r>
-            <w:proofErr w:type="spellEnd"/>
-            <w:r>
-              <w:rPr>
-                <w:lang w:val="en-US"/>
-              </w:rPr>
-              <w:t xml:space="preserve"> finches)</w:t>
+              <w:t xml:space="preserve">Finches varied in beak shape and size across different islands </w:t>
             </w:r>
           </w:p>
           <w:p>
@@ -837,7 +993,6 @@
               <w:rPr>
                 <w:lang w:val="en-US"/>
               </w:rPr>
-              <w:lastRenderedPageBreak/>
               <w:t xml:space="preserve">These patterns </w:t>
             </w:r>
             <w:proofErr w:type="gramStart"/>
@@ -872,6 +1027,189 @@
           <w:p>
             <w:pPr>
               <w:rPr>
+                <w:lang w:val="en-TO"/>
+              </w:rPr>
+            </w:pPr>
+            <w:r>
+              <w:rPr>
+                <w:lang w:val="en-US"/>
+              </w:rPr>
+              <w:br/>
+            </w:r>
+            <w:r>
+              <w:rPr>
+                <w:lang w:val="en-TO"/>
+              </w:rPr>
+              <w:t>Darwin’s theory was met with strong resistance for several reasons:</w:t>
+            </w:r>
+          </w:p>
+          <w:p>
+            <w:pPr>
+              <w:numPr>
+                <w:ilvl w:val="0"/>
+                <w:numId w:val="12"/>
+              </w:numPr>
+              <w:rPr>
+                <w:lang w:val="en-TO"/>
+              </w:rPr>
+            </w:pPr>
+            <w:r>
+              <w:rPr>
+                <w:lang w:val="en-TO"/>
+              </w:rPr>
+              <w:t>It c</w:t>
+            </w:r>
+            <w:r>
+              <w:rPr>
+                <w:lang w:val="en-TO"/>
+              </w:rPr>
+              <w:t>onflict</w:t>
+            </w:r>
+            <w:r>
+              <w:rPr>
+                <w:lang w:val="en-TO"/>
+              </w:rPr>
+              <w:t>ed</w:t>
+            </w:r>
+            <w:r>
+              <w:rPr>
+                <w:lang w:val="en-TO"/>
+              </w:rPr>
+              <w:t xml:space="preserve"> with literal interpretations of scripture:</w:t>
+            </w:r>
+            <w:r>
+              <w:rPr>
+                <w:lang w:val="en-TO"/>
+              </w:rPr>
+              <w:br/>
+              <w:t xml:space="preserve">His ideas challenged the belief in fixed species, a young </w:t>
+            </w:r>
+            <w:r>
+              <w:rPr>
+                <w:lang w:val="en-TO"/>
+              </w:rPr>
+              <w:t>e</w:t>
+            </w:r>
+            <w:r>
+              <w:rPr>
+                <w:lang w:val="en-TO"/>
+              </w:rPr>
+              <w:t xml:space="preserve">arth, and separate creation as understood from Genesis. </w:t>
+            </w:r>
+          </w:p>
+          <w:p>
+            <w:pPr>
+              <w:numPr>
+                <w:ilvl w:val="0"/>
+                <w:numId w:val="12"/>
+              </w:numPr>
+              <w:rPr>
+                <w:lang w:val="en-TO"/>
+              </w:rPr>
+            </w:pPr>
+            <w:r>
+              <w:rPr>
+                <w:lang w:val="en-TO"/>
+              </w:rPr>
+              <w:t>Threat</w:t>
+            </w:r>
+            <w:r>
+              <w:rPr>
+                <w:lang w:val="en-TO"/>
+              </w:rPr>
+              <w:t>ened</w:t>
+            </w:r>
+            <w:r>
+              <w:rPr>
+                <w:lang w:val="en-TO"/>
+              </w:rPr>
+              <w:t xml:space="preserve"> human uniqueness:</w:t>
+            </w:r>
+            <w:r>
+              <w:rPr>
+                <w:lang w:val="en-TO"/>
+              </w:rPr>
+              <w:br/>
+              <w:t xml:space="preserve">The idea that humans share ancestry with other life challenged long-held views about humanity’s special status. </w:t>
+            </w:r>
+          </w:p>
+          <w:p>
+            <w:pPr>
+              <w:numPr>
+                <w:ilvl w:val="0"/>
+                <w:numId w:val="12"/>
+              </w:numPr>
+              <w:rPr>
+                <w:lang w:val="en-TO"/>
+              </w:rPr>
+            </w:pPr>
+            <w:r>
+              <w:rPr>
+                <w:lang w:val="en-TO"/>
+              </w:rPr>
+              <w:t>This also implied that:</w:t>
+            </w:r>
+            <w:r>
+              <w:rPr>
+                <w:lang w:val="en-TO"/>
+              </w:rPr>
+              <w:t xml:space="preserve"> </w:t>
+            </w:r>
+          </w:p>
+          <w:p>
+            <w:pPr>
+              <w:numPr>
+                <w:ilvl w:val="1"/>
+                <w:numId w:val="12"/>
+              </w:numPr>
+              <w:rPr>
+                <w:lang w:val="en-TO"/>
+              </w:rPr>
+            </w:pPr>
+            <w:r>
+              <w:rPr>
+                <w:lang w:val="en-TO"/>
+              </w:rPr>
+              <w:t xml:space="preserve">life is random </w:t>
+            </w:r>
+          </w:p>
+          <w:p>
+            <w:pPr>
+              <w:numPr>
+                <w:ilvl w:val="1"/>
+                <w:numId w:val="12"/>
+              </w:numPr>
+              <w:rPr>
+                <w:lang w:val="en-TO"/>
+              </w:rPr>
+            </w:pPr>
+            <w:r>
+              <w:rPr>
+                <w:lang w:val="en-TO"/>
+              </w:rPr>
+              <w:t xml:space="preserve">there is no purpose </w:t>
+            </w:r>
+          </w:p>
+          <w:p>
+            <w:pPr>
+              <w:numPr>
+                <w:ilvl w:val="1"/>
+                <w:numId w:val="12"/>
+              </w:numPr>
+              <w:rPr>
+                <w:lang w:val="en-TO"/>
+              </w:rPr>
+            </w:pPr>
+            <w:r>
+              <w:rPr>
+                <w:lang w:val="en-TO"/>
+              </w:rPr>
+              <w:t>humans have no special value</w:t>
+            </w:r>
+          </w:p>
+          <w:p>
+            <w:pPr>
+              <w:rPr>
                 <w:lang w:val="en-US"/>
               </w:rPr>
             </w:pPr>
@@ -883,117 +1221,24 @@
               </w:rPr>
             </w:pPr>
             <w:r>
-              <w:rPr>
-                <w:lang w:val="en-US"/>
-              </w:rPr>
-              <w:t xml:space="preserve">When Darwin published </w:t>
-            </w:r>
-            <w:r>
-              <w:rPr>
-                <w:i/>
-                <w:iCs/>
-                <w:lang w:val="en-US"/>
-              </w:rPr>
-              <w:t xml:space="preserve">On the Origin of Species </w:t>
-            </w:r>
-            <w:r>
-              <w:rPr>
-                <w:lang w:val="en-US"/>
-              </w:rPr>
-              <w:t xml:space="preserve">in 1859, his </w:t>
-            </w:r>
-            <w:r>
-              <w:rPr>
-                <w:lang w:val="en-US"/>
-              </w:rPr>
-              <w:t>theory of evolution centered around the idea of natural selection. Species change over time, particularly the species with advantageous traits survive and reproduce – thus, over long periods of time, leads to the creation of new species.</w:t>
-            </w:r>
-            <w:r>
-              <w:rPr>
-                <w:lang w:val="en-US"/>
-              </w:rPr>
-              <w:br/>
-              <w:t>People strongly opposed his idea because:</w:t>
-            </w:r>
-          </w:p>
-          <w:p>
-            <w:pPr>
-              <w:pStyle w:val="ListParagraph"/>
-              <w:numPr>
-                <w:ilvl w:val="0"/>
-                <w:numId w:val="9"/>
-              </w:numPr>
-              <w:rPr>
-                <w:lang w:val="en-US"/>
-              </w:rPr>
-            </w:pPr>
-            <w:r>
-              <w:rPr>
-                <w:lang w:val="en-US"/>
-              </w:rPr>
-              <w:t xml:space="preserve">It contradicted </w:t>
-            </w:r>
-            <w:r>
-              <w:rPr>
-                <w:i/>
-                <w:iCs/>
-                <w:lang w:val="en-US"/>
-              </w:rPr>
-              <w:t>literal</w:t>
-            </w:r>
-            <w:r>
-              <w:rPr>
-                <w:lang w:val="en-US"/>
-              </w:rPr>
-              <w:t xml:space="preserve"> interpretations of Genesis</w:t>
-            </w:r>
-          </w:p>
-          <w:p>
-            <w:pPr>
-              <w:pStyle w:val="ListParagraph"/>
-              <w:numPr>
-                <w:ilvl w:val="0"/>
-                <w:numId w:val="9"/>
-              </w:numPr>
-              <w:rPr>
-                <w:lang w:val="en-US"/>
-              </w:rPr>
-            </w:pPr>
-            <w:r>
-              <w:rPr>
-                <w:lang w:val="en-US"/>
-              </w:rPr>
-              <w:t>Humanity’s uniqueness was threatened</w:t>
-            </w:r>
-          </w:p>
-          <w:p>
-            <w:pPr>
-              <w:pStyle w:val="ListParagraph"/>
-              <w:numPr>
-                <w:ilvl w:val="0"/>
-                <w:numId w:val="9"/>
-              </w:numPr>
-              <w:rPr>
-                <w:lang w:val="en-US"/>
-              </w:rPr>
-            </w:pPr>
-            <w:r>
-              <w:rPr>
-                <w:lang w:val="en-US"/>
-              </w:rPr>
-              <w:t>This also implied life is a random process. Humans didn’t have purpose or hierarchy in the categories of the material world.</w:t>
+              <w:t>Darwin’s theory did not aim to explain the meaning or purpose of life, but rather the process by which life develops.</w:t>
+            </w:r>
+            <w:r>
+              <w:t xml:space="preserve"> Humans did have special purpose but that lied in their spiritual identity – which is something religion attempts to explain not science.</w:t>
+            </w:r>
+            <w:r>
+              <w:t xml:space="preserve"> </w:t>
+            </w:r>
+            <w:r>
+              <w:t>The tension, therefore, was</w:t>
+            </w:r>
+            <w:r>
+              <w:t xml:space="preserve"> between new scientific evidence and existing interpretations of belief.</w:t>
             </w:r>
           </w:p>
         </w:tc>
       </w:tr>
     </w:tbl>
-    <w:p>
-      <w:pPr>
-        <w:rPr>
-          <w:lang w:val="en-US"/>
-        </w:rPr>
-      </w:pPr>
-    </w:p>
     <w:p>
       <w:pPr>
         <w:rPr>
@@ -1008,17 +1253,22 @@
           <w:bCs/>
           <w:lang w:val="en-US"/>
         </w:rPr>
+        <w:lastRenderedPageBreak/>
         <w:t>Instructions:</w:t>
       </w:r>
     </w:p>
     <w:p>
       <w:pPr>
         <w:rPr>
+          <w:sz w:val="18"/>
+          <w:szCs w:val="18"/>
           <w:lang w:val="en-US"/>
         </w:rPr>
       </w:pPr>
       <w:r>
         <w:rPr>
+          <w:sz w:val="18"/>
+          <w:szCs w:val="18"/>
           <w:lang w:val="en-US"/>
         </w:rPr>
         <w:t xml:space="preserve">Based on your case study, answer the following questions below </w:t>
@@ -1026,6 +1276,8 @@
       <w:proofErr w:type="gramStart"/>
       <w:r>
         <w:rPr>
+          <w:sz w:val="18"/>
+          <w:szCs w:val="18"/>
           <w:lang w:val="en-US"/>
         </w:rPr>
         <w:t>to  your</w:t>
@@ -1033,6 +1285,8 @@
       <w:proofErr w:type="gramEnd"/>
       <w:r>
         <w:rPr>
+          <w:sz w:val="18"/>
+          <w:szCs w:val="18"/>
           <w:lang w:val="en-US"/>
         </w:rPr>
         <w:t xml:space="preserve"> scenario.</w:t>
@@ -1046,49 +1300,65 @@
           <w:numId w:val="6"/>
         </w:numPr>
         <w:rPr>
+          <w:b/>
+          <w:bCs/>
+          <w:sz w:val="20"/>
+          <w:szCs w:val="20"/>
           <w:lang w:val="en-US"/>
         </w:rPr>
       </w:pPr>
       <w:r>
         <w:rPr>
+          <w:b/>
+          <w:bCs/>
+          <w:sz w:val="20"/>
+          <w:szCs w:val="20"/>
           <w:lang w:val="en-US"/>
         </w:rPr>
         <w:t>What was the new scientific idea emerging with</w:t>
       </w:r>
       <w:r>
         <w:rPr>
+          <w:b/>
+          <w:bCs/>
+          <w:sz w:val="20"/>
+          <w:szCs w:val="20"/>
           <w:lang w:val="en-US"/>
         </w:rPr>
         <w:t xml:space="preserve"> your case study</w:t>
       </w:r>
       <w:r>
         <w:rPr>
+          <w:b/>
+          <w:bCs/>
+          <w:sz w:val="20"/>
+          <w:szCs w:val="20"/>
           <w:lang w:val="en-US"/>
         </w:rPr>
-        <w:t>. State their new discovery.</w:t>
+        <w:t>. State their new discovery</w:t>
       </w:r>
     </w:p>
     <w:p>
       <w:pPr>
         <w:pStyle w:val="ListParagraph"/>
+        <w:numPr>
+          <w:ilvl w:val="0"/>
+          <w:numId w:val="10"/>
+        </w:numPr>
         <w:rPr>
+          <w:b/>
+          <w:bCs/>
+          <w:sz w:val="20"/>
+          <w:szCs w:val="20"/>
           <w:lang w:val="en-US"/>
         </w:rPr>
       </w:pPr>
-    </w:p>
-    <w:p>
-      <w:pPr>
-        <w:pStyle w:val="ListParagraph"/>
-        <w:numPr>
-          <w:ilvl w:val="1"/>
-          <w:numId w:val="6"/>
-        </w:numPr>
-        <w:rPr>
-          <w:lang w:val="en-US"/>
-        </w:rPr>
-      </w:pPr>
       <w:r>
         <w:rPr>
+          <w:b/>
+          <w:bCs/>
+          <w:sz w:val="20"/>
+          <w:szCs w:val="20"/>
           <w:lang w:val="en-US"/>
         </w:rPr>
         <w:t>What evidence/observations did they have to support their claim?</w:t>
@@ -1097,175 +1367,50 @@
     <w:p>
       <w:pPr>
         <w:pStyle w:val="ListParagraph"/>
+        <w:numPr>
+          <w:ilvl w:val="0"/>
+          <w:numId w:val="10"/>
+        </w:numPr>
         <w:rPr>
+          <w:b/>
+          <w:bCs/>
+          <w:sz w:val="20"/>
+          <w:szCs w:val="20"/>
           <w:lang w:val="en-US"/>
         </w:rPr>
       </w:pPr>
-    </w:p>
-    <w:p>
-      <w:pPr>
-        <w:pStyle w:val="ListParagraph"/>
-        <w:numPr>
-          <w:ilvl w:val="0"/>
-          <w:numId w:val="6"/>
-        </w:numPr>
-        <w:rPr>
-          <w:lang w:val="en-US"/>
-        </w:rPr>
-      </w:pPr>
       <w:r>
         <w:rPr>
+          <w:b/>
+          <w:bCs/>
+          <w:sz w:val="20"/>
+          <w:szCs w:val="20"/>
           <w:lang w:val="en-US"/>
         </w:rPr>
         <w:t>What beliefs/assumptions already existed at the time</w:t>
       </w:r>
-      <w:r>
-        <w:rPr>
-          <w:lang w:val="en-US"/>
-        </w:rPr>
-        <w:t>.</w:t>
-      </w:r>
-    </w:p>
-    <w:p>
-      <w:pPr>
-        <w:pStyle w:val="ListParagraph"/>
-        <w:numPr>
-          <w:ilvl w:val="1"/>
-          <w:numId w:val="6"/>
-        </w:numPr>
-        <w:rPr>
-          <w:lang w:val="en-US"/>
-        </w:rPr>
-      </w:pPr>
-      <w:r>
-        <w:rPr>
-          <w:lang w:val="en-US"/>
-        </w:rPr>
-        <w:t>Were these beliefs scientific, religious, a mix?</w:t>
-      </w:r>
-    </w:p>
-    <w:p>
-      <w:pPr>
-        <w:pStyle w:val="ListParagraph"/>
-        <w:numPr>
-          <w:ilvl w:val="1"/>
-          <w:numId w:val="6"/>
-        </w:numPr>
-        <w:rPr>
-          <w:lang w:val="en-US"/>
-        </w:rPr>
-      </w:pPr>
-      <w:r>
-        <w:rPr>
-          <w:lang w:val="en-US"/>
-        </w:rPr>
-        <w:t xml:space="preserve">Where did these beliefs come from </w:t>
-      </w:r>
-    </w:p>
-    <w:tbl>
-      <w:tblPr>
-        <w:tblStyle w:val="TableGrid"/>
-        <w:tblW w:w="0" w:type="auto"/>
-        <w:tblInd w:w="720" w:type="dxa"/>
-        <w:tblLook w:val="04A0" w:firstRow="1" w:lastRow="0" w:firstColumn="1" w:lastColumn="0" w:noHBand="0" w:noVBand="1"/>
-      </w:tblPr>
-      <w:tblGrid>
-        <w:gridCol w:w="2775"/>
-        <w:gridCol w:w="2940"/>
-        <w:gridCol w:w="2581"/>
-      </w:tblGrid>
-      <w:tr>
-        <w:tc>
-          <w:tcPr>
-            <w:tcW w:w="2775" w:type="dxa"/>
-          </w:tcPr>
-          <w:p>
-            <w:pPr>
-              <w:pStyle w:val="ListParagraph"/>
-              <w:numPr>
-                <w:ilvl w:val="0"/>
-                <w:numId w:val="2"/>
-              </w:numPr>
-              <w:rPr>
-                <w:lang w:val="en-US"/>
-              </w:rPr>
-            </w:pPr>
-            <w:r>
-              <w:rPr>
-                <w:lang w:val="en-US"/>
-              </w:rPr>
-              <w:t>Philosophy</w:t>
-            </w:r>
-          </w:p>
-        </w:tc>
-        <w:tc>
-          <w:tcPr>
-            <w:tcW w:w="2940" w:type="dxa"/>
-          </w:tcPr>
-          <w:p>
-            <w:pPr>
-              <w:pStyle w:val="ListParagraph"/>
-              <w:numPr>
-                <w:ilvl w:val="0"/>
-                <w:numId w:val="2"/>
-              </w:numPr>
-              <w:rPr>
-                <w:lang w:val="en-US"/>
-              </w:rPr>
-            </w:pPr>
-            <w:r>
-              <w:rPr>
-                <w:lang w:val="en-US"/>
-              </w:rPr>
-              <w:t>Scripture</w:t>
-            </w:r>
-          </w:p>
-        </w:tc>
-        <w:tc>
-          <w:tcPr>
-            <w:tcW w:w="2581" w:type="dxa"/>
-          </w:tcPr>
-          <w:p>
-            <w:pPr>
-              <w:pStyle w:val="ListParagraph"/>
-              <w:numPr>
-                <w:ilvl w:val="0"/>
-                <w:numId w:val="2"/>
-              </w:numPr>
-              <w:rPr>
-                <w:lang w:val="en-US"/>
-              </w:rPr>
-            </w:pPr>
-            <w:r>
-              <w:rPr>
-                <w:lang w:val="en-US"/>
-              </w:rPr>
-              <w:t>Scientific research</w:t>
-            </w:r>
-          </w:p>
-        </w:tc>
-      </w:tr>
-    </w:tbl>
-    <w:p>
-      <w:pPr>
-        <w:rPr>
-          <w:lang w:val="en-US"/>
-        </w:rPr>
-      </w:pPr>
     </w:p>
     <w:p>
       <w:pPr>
         <w:pStyle w:val="ListParagraph"/>
         <w:numPr>
           <w:ilvl w:val="0"/>
-          <w:numId w:val="6"/>
+          <w:numId w:val="10"/>
         </w:numPr>
         <w:rPr>
+          <w:b/>
+          <w:bCs/>
+          <w:sz w:val="20"/>
+          <w:szCs w:val="20"/>
           <w:lang w:val="en-US"/>
         </w:rPr>
       </w:pPr>
       <w:r>
         <w:rPr>
+          <w:b/>
+          <w:bCs/>
+          <w:sz w:val="20"/>
+          <w:szCs w:val="20"/>
           <w:lang w:val="en-US"/>
         </w:rPr>
         <w:t>How did people respond to the new idea?</w:t>
@@ -1276,14 +1421,18 @@
         <w:pStyle w:val="ListParagraph"/>
         <w:numPr>
           <w:ilvl w:val="1"/>
-          <w:numId w:val="6"/>
+          <w:numId w:val="10"/>
         </w:numPr>
         <w:rPr>
+          <w:sz w:val="20"/>
+          <w:szCs w:val="20"/>
           <w:lang w:val="en-US"/>
         </w:rPr>
       </w:pPr>
       <w:r>
         <w:rPr>
+          <w:sz w:val="20"/>
+          <w:szCs w:val="20"/>
           <w:lang w:val="en-US"/>
         </w:rPr>
         <w:t xml:space="preserve">Did they accept/reject it? </w:t>
@@ -1294,20 +1443,26 @@
         <w:pStyle w:val="ListParagraph"/>
         <w:numPr>
           <w:ilvl w:val="1"/>
-          <w:numId w:val="6"/>
+          <w:numId w:val="10"/>
         </w:numPr>
         <w:rPr>
+          <w:sz w:val="20"/>
+          <w:szCs w:val="20"/>
           <w:lang w:val="en-US"/>
         </w:rPr>
       </w:pPr>
       <w:r>
         <w:rPr>
+          <w:sz w:val="20"/>
+          <w:szCs w:val="20"/>
           <w:lang w:val="en-US"/>
         </w:rPr>
         <w:t>Why did they resist the idea? Was it authority? Tradition? Fear of change? Did they practice independent investigat</w:t>
       </w:r>
       <w:r>
         <w:rPr>
+          <w:sz w:val="20"/>
+          <w:szCs w:val="20"/>
           <w:lang w:val="en-US"/>
         </w:rPr>
         <w:t>ion?</w:t>
@@ -1318,14 +1473,22 @@
         <w:pStyle w:val="ListParagraph"/>
         <w:numPr>
           <w:ilvl w:val="0"/>
-          <w:numId w:val="6"/>
+          <w:numId w:val="10"/>
         </w:numPr>
         <w:rPr>
+          <w:b/>
+          <w:bCs/>
+          <w:sz w:val="20"/>
+          <w:szCs w:val="20"/>
           <w:lang w:val="en-US"/>
         </w:rPr>
       </w:pPr>
       <w:r>
         <w:rPr>
+          <w:b/>
+          <w:bCs/>
+          <w:sz w:val="20"/>
+          <w:szCs w:val="20"/>
           <w:lang w:val="en-US"/>
         </w:rPr>
         <w:t>Where did the misunderstanding occur?</w:t>
@@ -1336,20 +1499,26 @@
         <w:pStyle w:val="ListParagraph"/>
         <w:numPr>
           <w:ilvl w:val="1"/>
-          <w:numId w:val="6"/>
+          <w:numId w:val="10"/>
         </w:numPr>
         <w:rPr>
+          <w:sz w:val="20"/>
+          <w:szCs w:val="20"/>
           <w:lang w:val="en-US"/>
         </w:rPr>
       </w:pPr>
       <w:r>
         <w:rPr>
+          <w:sz w:val="20"/>
+          <w:szCs w:val="20"/>
           <w:lang w:val="en-US"/>
         </w:rPr>
         <w:t>Was religion being used to explain scientific phenomena?</w:t>
       </w:r>
       <w:r>
         <w:rPr>
+          <w:sz w:val="20"/>
+          <w:szCs w:val="20"/>
           <w:lang w:val="en-US"/>
         </w:rPr>
         <w:br/>
@@ -1475,6 +1644,119 @@
     </w:lvl>
   </w:abstractNum>
   <w:abstractNum w:abstractNumId="1" w15:restartNumberingAfterBreak="0">
+    <w:nsid w:val="3014346B"/>
+    <w:multiLevelType w:val="hybridMultilevel"/>
+    <w:tmpl w:val="4EF20318"/>
+    <w:lvl w:ilvl="0" w:tplc="0C090001">
+      <w:start w:val="1"/>
+      <w:numFmt w:val="bullet"/>
+      <w:lvlText w:val=""/>
+      <w:lvlJc w:val="left"/>
+      <w:pPr>
+        <w:ind w:left="720" w:hanging="360"/>
+      </w:pPr>
+      <w:rPr>
+        <w:rFonts w:ascii="Symbol" w:hAnsi="Symbol" w:hint="default"/>
+      </w:rPr>
+    </w:lvl>
+    <w:lvl w:ilvl="1" w:tplc="20000003">
+      <w:start w:val="1"/>
+      <w:numFmt w:val="bullet"/>
+      <w:lvlText w:val="o"/>
+      <w:lvlJc w:val="left"/>
+      <w:pPr>
+        <w:ind w:left="1440" w:hanging="360"/>
+      </w:pPr>
+      <w:rPr>
+        <w:rFonts w:ascii="Courier New" w:hAnsi="Courier New" w:cs="Courier New" w:hint="default"/>
+      </w:rPr>
+    </w:lvl>
+    <w:lvl w:ilvl="2" w:tplc="20000005" w:tentative="1">
+      <w:start w:val="1"/>
+      <w:numFmt w:val="bullet"/>
+      <w:lvlText w:val=""/>
+      <w:lvlJc w:val="left"/>
+      <w:pPr>
+        <w:ind w:left="2160" w:hanging="360"/>
+      </w:pPr>
+      <w:rPr>
+        <w:rFonts w:ascii="Wingdings" w:hAnsi="Wingdings" w:hint="default"/>
+      </w:rPr>
+    </w:lvl>
+    <w:lvl w:ilvl="3" w:tplc="20000001" w:tentative="1">
+      <w:start w:val="1"/>
+      <w:numFmt w:val="bullet"/>
+      <w:lvlText w:val=""/>
+      <w:lvlJc w:val="left"/>
+      <w:pPr>
+        <w:ind w:left="2880" w:hanging="360"/>
+      </w:pPr>
+      <w:rPr>
+        <w:rFonts w:ascii="Symbol" w:hAnsi="Symbol" w:hint="default"/>
+      </w:rPr>
+    </w:lvl>
+    <w:lvl w:ilvl="4" w:tplc="20000003" w:tentative="1">
+      <w:start w:val="1"/>
+      <w:numFmt w:val="bullet"/>
+      <w:lvlText w:val="o"/>
+      <w:lvlJc w:val="left"/>
+      <w:pPr>
+        <w:ind w:left="3600" w:hanging="360"/>
+      </w:pPr>
+      <w:rPr>
+        <w:rFonts w:ascii="Courier New" w:hAnsi="Courier New" w:cs="Courier New" w:hint="default"/>
+      </w:rPr>
+    </w:lvl>
+    <w:lvl w:ilvl="5" w:tplc="20000005" w:tentative="1">
+      <w:start w:val="1"/>
+      <w:numFmt w:val="bullet"/>
+      <w:lvlText w:val=""/>
+      <w:lvlJc w:val="left"/>
+      <w:pPr>
+        <w:ind w:left="4320" w:hanging="360"/>
+      </w:pPr>
+      <w:rPr>
+        <w:rFonts w:ascii="Wingdings" w:hAnsi="Wingdings" w:hint="default"/>
+      </w:rPr>
+    </w:lvl>
+    <w:lvl w:ilvl="6" w:tplc="20000001" w:tentative="1">
+      <w:start w:val="1"/>
+      <w:numFmt w:val="bullet"/>
+      <w:lvlText w:val=""/>
+      <w:lvlJc w:val="left"/>
+      <w:pPr>
+        <w:ind w:left="5040" w:hanging="360"/>
+      </w:pPr>
+      <w:rPr>
+        <w:rFonts w:ascii="Symbol" w:hAnsi="Symbol" w:hint="default"/>
+      </w:rPr>
+    </w:lvl>
+    <w:lvl w:ilvl="7" w:tplc="20000003" w:tentative="1">
+      <w:start w:val="1"/>
+      <w:numFmt w:val="bullet"/>
+      <w:lvlText w:val="o"/>
+      <w:lvlJc w:val="left"/>
+      <w:pPr>
+        <w:ind w:left="5760" w:hanging="360"/>
+      </w:pPr>
+      <w:rPr>
+        <w:rFonts w:ascii="Courier New" w:hAnsi="Courier New" w:cs="Courier New" w:hint="default"/>
+      </w:rPr>
+    </w:lvl>
+    <w:lvl w:ilvl="8" w:tplc="20000005" w:tentative="1">
+      <w:start w:val="1"/>
+      <w:numFmt w:val="bullet"/>
+      <w:lvlText w:val=""/>
+      <w:lvlJc w:val="left"/>
+      <w:pPr>
+        <w:ind w:left="6480" w:hanging="360"/>
+      </w:pPr>
+      <w:rPr>
+        <w:rFonts w:ascii="Wingdings" w:hAnsi="Wingdings" w:hint="default"/>
+      </w:rPr>
+    </w:lvl>
+  </w:abstractNum>
+  <w:abstractNum w:abstractNumId="2" w15:restartNumberingAfterBreak="0">
     <w:nsid w:val="30D05062"/>
     <w:multiLevelType w:val="hybridMultilevel"/>
     <w:tmpl w:val="000AF260"/>
@@ -1587,7 +1869,96 @@
       </w:rPr>
     </w:lvl>
   </w:abstractNum>
-  <w:abstractNum w:abstractNumId="2" w15:restartNumberingAfterBreak="0">
+  <w:abstractNum w:abstractNumId="3" w15:restartNumberingAfterBreak="0">
+    <w:nsid w:val="3F486A99"/>
+    <w:multiLevelType w:val="hybridMultilevel"/>
+    <w:tmpl w:val="E2266B74"/>
+    <w:lvl w:ilvl="0" w:tplc="3D16C840">
+      <w:start w:val="2"/>
+      <w:numFmt w:val="decimal"/>
+      <w:lvlText w:val="%1"/>
+      <w:lvlJc w:val="left"/>
+      <w:pPr>
+        <w:ind w:left="720" w:hanging="360"/>
+      </w:pPr>
+      <w:rPr>
+        <w:rFonts w:hint="default"/>
+      </w:rPr>
+    </w:lvl>
+    <w:lvl w:ilvl="1" w:tplc="20000019">
+      <w:start w:val="1"/>
+      <w:numFmt w:val="lowerLetter"/>
+      <w:lvlText w:val="%2."/>
+      <w:lvlJc w:val="left"/>
+      <w:pPr>
+        <w:ind w:left="1440" w:hanging="360"/>
+      </w:pPr>
+    </w:lvl>
+    <w:lvl w:ilvl="2" w:tplc="2000001B" w:tentative="1">
+      <w:start w:val="1"/>
+      <w:numFmt w:val="lowerRoman"/>
+      <w:lvlText w:val="%3."/>
+      <w:lvlJc w:val="right"/>
+      <w:pPr>
+        <w:ind w:left="2160" w:hanging="180"/>
+      </w:pPr>
+    </w:lvl>
+    <w:lvl w:ilvl="3" w:tplc="2000000F" w:tentative="1">
+      <w:start w:val="1"/>
+      <w:numFmt w:val="decimal"/>
+      <w:lvlText w:val="%4."/>
+      <w:lvlJc w:val="left"/>
+      <w:pPr>
+        <w:ind w:left="2880" w:hanging="360"/>
+      </w:pPr>
+    </w:lvl>
+    <w:lvl w:ilvl="4" w:tplc="20000019" w:tentative="1">
+      <w:start w:val="1"/>
+      <w:numFmt w:val="lowerLetter"/>
+      <w:lvlText w:val="%5."/>
+      <w:lvlJc w:val="left"/>
+      <w:pPr>
+        <w:ind w:left="3600" w:hanging="360"/>
+      </w:pPr>
+    </w:lvl>
+    <w:lvl w:ilvl="5" w:tplc="2000001B" w:tentative="1">
+      <w:start w:val="1"/>
+      <w:numFmt w:val="lowerRoman"/>
+      <w:lvlText w:val="%6."/>
+      <w:lvlJc w:val="right"/>
+      <w:pPr>
+        <w:ind w:left="4320" w:hanging="180"/>
+      </w:pPr>
+    </w:lvl>
+    <w:lvl w:ilvl="6" w:tplc="2000000F" w:tentative="1">
+      <w:start w:val="1"/>
+      <w:numFmt w:val="decimal"/>
+      <w:lvlText w:val="%7."/>
+      <w:lvlJc w:val="left"/>
+      <w:pPr>
+        <w:ind w:left="5040" w:hanging="360"/>
+      </w:pPr>
+    </w:lvl>
+    <w:lvl w:ilvl="7" w:tplc="20000019" w:tentative="1">
+      <w:start w:val="1"/>
+      <w:numFmt w:val="lowerLetter"/>
+      <w:lvlText w:val="%8."/>
+      <w:lvlJc w:val="left"/>
+      <w:pPr>
+        <w:ind w:left="5760" w:hanging="360"/>
+      </w:pPr>
+    </w:lvl>
+    <w:lvl w:ilvl="8" w:tplc="2000001B" w:tentative="1">
+      <w:start w:val="1"/>
+      <w:numFmt w:val="lowerRoman"/>
+      <w:lvlText w:val="%9."/>
+      <w:lvlJc w:val="right"/>
+      <w:pPr>
+        <w:ind w:left="6480" w:hanging="180"/>
+      </w:pPr>
+    </w:lvl>
+  </w:abstractNum>
+  <w:abstractNum w:abstractNumId="4" w15:restartNumberingAfterBreak="0">
     <w:nsid w:val="44D3168A"/>
     <w:multiLevelType w:val="hybridMultilevel"/>
     <w:tmpl w:val="A4B8A448"/>
@@ -1700,7 +2071,7 @@
       </w:rPr>
     </w:lvl>
   </w:abstractNum>
-  <w:abstractNum w:abstractNumId="3" w15:restartNumberingAfterBreak="0">
+  <w:abstractNum w:abstractNumId="5" w15:restartNumberingAfterBreak="0">
     <w:nsid w:val="502011A0"/>
     <w:multiLevelType w:val="hybridMultilevel"/>
     <w:tmpl w:val="926CB4BA"/>
@@ -1813,7 +2184,7 @@
       </w:rPr>
     </w:lvl>
   </w:abstractNum>
-  <w:abstractNum w:abstractNumId="4" w15:restartNumberingAfterBreak="0">
+  <w:abstractNum w:abstractNumId="6" w15:restartNumberingAfterBreak="0">
     <w:nsid w:val="55C36A44"/>
     <w:multiLevelType w:val="hybridMultilevel"/>
     <w:tmpl w:val="FD0A0B94"/>
@@ -1926,7 +2297,7 @@
       </w:rPr>
     </w:lvl>
   </w:abstractNum>
-  <w:abstractNum w:abstractNumId="5" w15:restartNumberingAfterBreak="0">
+  <w:abstractNum w:abstractNumId="7" w15:restartNumberingAfterBreak="0">
     <w:nsid w:val="5D3D3A11"/>
     <w:multiLevelType w:val="hybridMultilevel"/>
     <w:tmpl w:val="C4E40866"/>
@@ -2039,7 +2410,156 @@
       </w:rPr>
     </w:lvl>
   </w:abstractNum>
-  <w:abstractNum w:abstractNumId="6" w15:restartNumberingAfterBreak="0">
+  <w:abstractNum w:abstractNumId="8" w15:restartNumberingAfterBreak="0">
+    <w:nsid w:val="5E85700D"/>
+    <w:multiLevelType w:val="multilevel"/>
+    <w:tmpl w:val="D3224304"/>
+    <w:lvl w:ilvl="0">
+      <w:start w:val="1"/>
+      <w:numFmt w:val="bullet"/>
+      <w:lvlText w:val=""/>
+      <w:lvlJc w:val="left"/>
+      <w:pPr>
+        <w:tabs>
+          <w:tab w:val="num" w:pos="720"/>
+        </w:tabs>
+        <w:ind w:left="720" w:hanging="360"/>
+      </w:pPr>
+      <w:rPr>
+        <w:rFonts w:ascii="Symbol" w:hAnsi="Symbol" w:hint="default"/>
+        <w:sz w:val="20"/>
+      </w:rPr>
+    </w:lvl>
+    <w:lvl w:ilvl="1">
+      <w:start w:val="1"/>
+      <w:numFmt w:val="bullet"/>
+      <w:lvlText w:val="o"/>
+      <w:lvlJc w:val="left"/>
+      <w:pPr>
+        <w:tabs>
+          <w:tab w:val="num" w:pos="1440"/>
+        </w:tabs>
+        <w:ind w:left="1440" w:hanging="360"/>
+      </w:pPr>
+      <w:rPr>
+        <w:rFonts w:ascii="Courier New" w:hAnsi="Courier New" w:hint="default"/>
+        <w:sz w:val="20"/>
+      </w:rPr>
+    </w:lvl>
+    <w:lvl w:ilvl="2" w:tentative="1">
+      <w:start w:val="1"/>
+      <w:numFmt w:val="bullet"/>
+      <w:lvlText w:val=""/>
+      <w:lvlJc w:val="left"/>
+      <w:pPr>
+        <w:tabs>
+          <w:tab w:val="num" w:pos="2160"/>
+        </w:tabs>
+        <w:ind w:left="2160" w:hanging="360"/>
+      </w:pPr>
+      <w:rPr>
+        <w:rFonts w:ascii="Wingdings" w:hAnsi="Wingdings" w:hint="default"/>
+        <w:sz w:val="20"/>
+      </w:rPr>
+    </w:lvl>
+    <w:lvl w:ilvl="3" w:tentative="1">
+      <w:start w:val="1"/>
+      <w:numFmt w:val="bullet"/>
+      <w:lvlText w:val=""/>
+      <w:lvlJc w:val="left"/>
+      <w:pPr>
+        <w:tabs>
+          <w:tab w:val="num" w:pos="2880"/>
+        </w:tabs>
+        <w:ind w:left="2880" w:hanging="360"/>
+      </w:pPr>
+      <w:rPr>
+        <w:rFonts w:ascii="Wingdings" w:hAnsi="Wingdings" w:hint="default"/>
+        <w:sz w:val="20"/>
+      </w:rPr>
+    </w:lvl>
+    <w:lvl w:ilvl="4" w:tentative="1">
+      <w:start w:val="1"/>
+      <w:numFmt w:val="bullet"/>
+      <w:lvlText w:val=""/>
+      <w:lvlJc w:val="left"/>
+      <w:pPr>
+        <w:tabs>
+          <w:tab w:val="num" w:pos="3600"/>
+        </w:tabs>
+        <w:ind w:left="3600" w:hanging="360"/>
+      </w:pPr>
+      <w:rPr>
+        <w:rFonts w:ascii="Wingdings" w:hAnsi="Wingdings" w:hint="default"/>
+        <w:sz w:val="20"/>
+      </w:rPr>
+    </w:lvl>
+    <w:lvl w:ilvl="5" w:tentative="1">
+      <w:start w:val="1"/>
+      <w:numFmt w:val="bullet"/>
+      <w:lvlText w:val=""/>
+      <w:lvlJc w:val="left"/>
+      <w:pPr>
+        <w:tabs>
+          <w:tab w:val="num" w:pos="4320"/>
+        </w:tabs>
+        <w:ind w:left="4320" w:hanging="360"/>
+      </w:pPr>
+      <w:rPr>
+        <w:rFonts w:ascii="Wingdings" w:hAnsi="Wingdings" w:hint="default"/>
+        <w:sz w:val="20"/>
+      </w:rPr>
+    </w:lvl>
+    <w:lvl w:ilvl="6" w:tentative="1">
+      <w:start w:val="1"/>
+      <w:numFmt w:val="bullet"/>
+      <w:lvlText w:val=""/>
+      <w:lvlJc w:val="left"/>
+      <w:pPr>
+        <w:tabs>
+          <w:tab w:val="num" w:pos="5040"/>
+        </w:tabs>
+        <w:ind w:left="5040" w:hanging="360"/>
+      </w:pPr>
+      <w:rPr>
+        <w:rFonts w:ascii="Wingdings" w:hAnsi="Wingdings" w:hint="default"/>
+        <w:sz w:val="20"/>
+      </w:rPr>
+    </w:lvl>
+    <w:lvl w:ilvl="7" w:tentative="1">
+      <w:start w:val="1"/>
+      <w:numFmt w:val="bullet"/>
+      <w:lvlText w:val=""/>
+      <w:lvlJc w:val="left"/>
+      <w:pPr>
+        <w:tabs>
+          <w:tab w:val="num" w:pos="5760"/>
+        </w:tabs>
+        <w:ind w:left="5760" w:hanging="360"/>
+      </w:pPr>
+      <w:rPr>
+        <w:rFonts w:ascii="Wingdings" w:hAnsi="Wingdings" w:hint="default"/>
+        <w:sz w:val="20"/>
+      </w:rPr>
+    </w:lvl>
+    <w:lvl w:ilvl="8" w:tentative="1">
+      <w:start w:val="1"/>
+      <w:numFmt w:val="bullet"/>
+      <w:lvlText w:val=""/>
+      <w:lvlJc w:val="left"/>
+      <w:pPr>
+        <w:tabs>
+          <w:tab w:val="num" w:pos="6480"/>
+        </w:tabs>
+        <w:ind w:left="6480" w:hanging="360"/>
+      </w:pPr>
+      <w:rPr>
+        <w:rFonts w:ascii="Wingdings" w:hAnsi="Wingdings" w:hint="default"/>
+        <w:sz w:val="20"/>
+      </w:rPr>
+    </w:lvl>
+  </w:abstractNum>
+  <w:abstractNum w:abstractNumId="9" w15:restartNumberingAfterBreak="0">
     <w:nsid w:val="6BF857C9"/>
     <w:multiLevelType w:val="hybridMultilevel"/>
     <w:tmpl w:val="8B02357E"/>
@@ -2128,7 +2648,7 @@
       </w:pPr>
     </w:lvl>
   </w:abstractNum>
-  <w:abstractNum w:abstractNumId="7" w15:restartNumberingAfterBreak="0">
+  <w:abstractNum w:abstractNumId="10" w15:restartNumberingAfterBreak="0">
     <w:nsid w:val="73B537F0"/>
     <w:multiLevelType w:val="hybridMultilevel"/>
     <w:tmpl w:val="71F09E36"/>
@@ -2241,7 +2761,7 @@
       </w:rPr>
     </w:lvl>
   </w:abstractNum>
-  <w:abstractNum w:abstractNumId="8" w15:restartNumberingAfterBreak="0">
+  <w:abstractNum w:abstractNumId="11" w15:restartNumberingAfterBreak="0">
     <w:nsid w:val="74FB0B15"/>
     <w:multiLevelType w:val="hybridMultilevel"/>
     <w:tmpl w:val="83D04A98"/>
@@ -2331,31 +2851,40 @@
     </w:lvl>
   </w:abstractNum>
   <w:num w:numId="1" w16cid:durableId="918103417">
-    <w:abstractNumId w:val="8"/>
+    <w:abstractNumId w:val="11"/>
   </w:num>
   <w:num w:numId="2" w16cid:durableId="685327203">
     <w:abstractNumId w:val="0"/>
   </w:num>
   <w:num w:numId="3" w16cid:durableId="1679426785">
+    <w:abstractNumId w:val="7"/>
+  </w:num>
+  <w:num w:numId="4" w16cid:durableId="266471285">
+    <w:abstractNumId w:val="6"/>
+  </w:num>
+  <w:num w:numId="5" w16cid:durableId="1555115056">
+    <w:abstractNumId w:val="10"/>
+  </w:num>
+  <w:num w:numId="6" w16cid:durableId="1559899447">
+    <w:abstractNumId w:val="9"/>
+  </w:num>
+  <w:num w:numId="7" w16cid:durableId="729963150">
+    <w:abstractNumId w:val="2"/>
+  </w:num>
+  <w:num w:numId="8" w16cid:durableId="1050305591">
     <w:abstractNumId w:val="5"/>
   </w:num>
-  <w:num w:numId="4" w16cid:durableId="266471285">
+  <w:num w:numId="9" w16cid:durableId="1336687891">
     <w:abstractNumId w:val="4"/>
   </w:num>
-  <w:num w:numId="5" w16cid:durableId="1555115056">
-    <w:abstractNumId w:val="7"/>
-  </w:num>
-  <w:num w:numId="6" w16cid:durableId="1559899447">
-    <w:abstractNumId w:val="6"/>
-  </w:num>
-  <w:num w:numId="7" w16cid:durableId="729963150">
-    <w:abstractNumId w:val="1"/>
-  </w:num>
-  <w:num w:numId="8" w16cid:durableId="1050305591">
+  <w:num w:numId="10" w16cid:durableId="506140617">
     <w:abstractNumId w:val="3"/>
   </w:num>
-  <w:num w:numId="9" w16cid:durableId="1336687891">
-    <w:abstractNumId w:val="2"/>
+  <w:num w:numId="11" w16cid:durableId="957180015">
+    <w:abstractNumId w:val="8"/>
+  </w:num>
+  <w:num w:numId="12" w16cid:durableId="365912761">
+    <w:abstractNumId w:val="1"/>
   </w:num>
 </w:numbering>
 </file>
@@ -3341,6 +3870,17 @@
       <w:lang w:val="en-TO"/>
     </w:rPr>
   </w:style>
+  <w:style w:type="paragraph" w:styleId="NormalWeb">
+    <w:name w:val="Normal (Web)"/>
+    <w:basedOn w:val="Normal"/>
+    <w:uiPriority w:val="99"/>
+    <w:semiHidden/>
+    <w:unhideWhenUsed/>
+    <w:rsid w:val="00865FA9"/>
+    <w:rPr>
+      <w:rFonts w:ascii="Times New Roman" w:hAnsi="Times New Roman" w:cs="Times New Roman"/>
+    </w:rPr>
+  </w:style>
 </w:styles>
 </file>
 

</xml_diff>